<commit_message>
Correct names and DIPEA in the 14 Oct minutes.
Use Yiwen, Geariod, Sarah, and QC人员, and replace DIPA with DIPEA.

Co-authored-by: peterli0913 <peterli0913@users.noreply.github.com>
</commit_message>
<xml_diff>
--- a/meetings/2026/2026-10-14-礼来客户会会议纪要.docx
+++ b/meetings/2026/2026-10-14-礼来客户会会议纪要.docx
@@ -66,7 +66,7 @@
           <w:color w:val="1C2833"/>
           <w:sz w:val="21"/>
         </w:rPr>
-        <w:t>今天和现场三位礼来把在审文件过了一遍。只是描述性修改的，由礼来回去催 feedback、关闭 comment；有实质问题的，今天当场讨论。今晚仍要看 Ewan、Sonia 是否还有新 comment，有的话明天继续在现场谈。</w:t>
+        <w:t>今天和现场三位礼来把在审文件过了一遍。只是描述性修改的，由礼来回去催 feedback、关闭 comment；有实质问题的，今天当场讨论。今晚仍要看 Yiwen、Sonia 是否还有新 comment，有的话明天继续在现场谈。</w:t>
       </w:r>
     </w:p>
     <w:p>
@@ -82,7 +82,7 @@
           <w:color w:val="1C2833"/>
           <w:sz w:val="21"/>
         </w:rPr>
-        <w:t>GAP 的 comment 已全部回复，上午与客户过完，没有留下待讨论项，待 Sonia、Ewan 确认后即可关闭。PVP 氧化后洗涤树脂的温度已与 Ewan 定为 −5～0℃、中心点 −3℃，并按他的建议增加预冷；礼来要求其他相关文件同步改，不能只改 PVP。</w:t>
+        <w:t>GAP 的 comment 已全部回复，上午与客户过完，没有留下待讨论项，待 Sonia、Yiwen 确认后即可关闭。PVP 氧化后洗涤树脂的温度已与 Yiwen 定为 −5～0℃、中心点 −3℃，并按他的建议增加预冷；礼来要求其他相关文件同步改，不能只改 PVP。</w:t>
       </w:r>
     </w:p>
     <w:p>
@@ -98,7 +98,7 @@
           <w:color w:val="1C2833"/>
           <w:sz w:val="21"/>
         </w:rPr>
-        <w:t>CCS 的风险写法已定：严重程度为 5 时，结论最低按中风险来写，不在结论里降级；结论之后的 action 说明当前能做的控制都已做，风险处于可控状态。TSP 切割小试，礼来坚持在 QC 检测；我方已说明 QC 不接受实验室研发样品，Jerry、Sara 回去对齐。若仍要求 QC 做，只能用纸质记录，并要确认是仅 PPQ 三批，还是后续商业化批次同样执行。</w:t>
+        <w:t>CCS 的风险写法已定：严重程度为 5 时，结论最低按中风险来写，不在结论里降级；结论之后的 action 说明当前能做的控制都已做，风险处于可控状态。TSP 切割小试，礼来坚持在 QC 检测；我方已说明 QC 不接受实验室研发样品，Geariod、Sarah 回去对齐。若仍要求 QC 做，只能用纸质记录，并要确认是仅 PPQ 三批，还是后续商业化批次同样执行。</w:t>
       </w:r>
     </w:p>
     <w:p>
@@ -114,7 +114,7 @@
           <w:color w:val="1C2833"/>
           <w:sz w:val="21"/>
         </w:rPr>
-        <w:t>ORA 和 GAP 在签批时仍 open 的 action，用 QMS 跟踪，完成期限为生产前，证据上传 QMS。CVP 与现场两位没有新的 open 项，等今晚 Sonia 的反馈。PQ readiness 已与 Sara 一致：全部 action 完成后，由凯莱英 QA 和礼来 QA 终批；模板已接受，其他项目也可按该 readiness 和 checklist 做。</w:t>
+        <w:t>ORA 和 GAP 在签批时仍 open 的 action，用 QMS 跟踪，完成期限为生产前，证据上传 QMS。CVP 与现场两位没有新的 open 项，等今晚 Sonia 的反馈。PQ readiness 已与 Sarah 一致：全部 action 完成后，由凯莱英 QA 和礼来 QA 终批；模板已接受，其他项目也可按该 readiness 和 checklist 做。</w:t>
       </w:r>
     </w:p>
     <w:p>
@@ -130,7 +130,7 @@
           <w:color w:val="1C2833"/>
           <w:sz w:val="21"/>
         </w:rPr>
-        <w:t>变更及附件的 comment 下午已讨论完。三片段 SPPS-1 启动前的 DMF 管路清洁验证，礼来想了解除 level 1 data check 之外有没有分析方法介入，明天准备说明。报警管理和配方 TCU 手动调温已解释，Jerry 没有进一步意见。明天现场看 DIPA 投料；激活罐须在天窗关闭后才能启动 SPPS；DIPA 从普通区到受控区的转移要给出短期措施和现状。球阀材质与 DMS、DMF 不兼容，今晚看能否解决，否则明天现场说明。调试和验证期间使用乙二醇一事已解释并关闭。QC 昨日遗留，明天由韩一杰解释。</w:t>
+        <w:t>变更及附件的 comment 下午已讨论完。三片段 SPPS-1 启动前的 DMF 管路清洁验证，礼来想了解除 level 1 data check 之外有没有分析方法介入，明天准备说明。报警管理和配方 TCU 手动调温已解释，Geariod 没有进一步意见。明天现场看 DIPEA 投料；激活罐须在天窗关闭后才能启动 SPPS；DIPEA 从普通区到受控区的转移要给出短期措施和现状。球阀材质与 DMS、DMF 不兼容，今晚看能否解决，否则明天现场说明。调试和验证期间使用乙二醇一事已解释并关闭。QC 昨日遗留，明天由 QC 人员解释。</w:t>
       </w:r>
     </w:p>
     <w:p>
@@ -331,7 +331,7 @@
                 <w:color w:val="1C2833"/>
                 <w:sz w:val="20"/>
               </w:rPr>
-              <w:t>• 若今晚 Ewan、Sonia 还有新 comment，明天继续在现场谈。离场前已与 Sara 说好。</w:t>
+              <w:t>• 若今晚 Yiwen、Sonia 还有新 comment，明天继续在现场谈。离场前已与 Sarah 说好。</w:t>
             </w:r>
           </w:p>
         </w:tc>
@@ -552,7 +552,7 @@
                 <w:color w:val="1C2833"/>
                 <w:sz w:val="20"/>
               </w:rPr>
-              <w:t>• Sonia 和 Ewan 确认我方回复是否满足要求。</w:t>
+              <w:t>• Sonia 和 Yiwen 确认我方回复是否满足要求。</w:t>
             </w:r>
           </w:p>
           <w:p>
@@ -866,7 +866,7 @@
                 <w:color w:val="1C2833"/>
                 <w:sz w:val="20"/>
               </w:rPr>
-              <w:t>• 氧化后洗涤树脂的中心点温度，今天与 Ewan 对齐。</w:t>
+              <w:t>• 氧化后洗涤树脂的中心点温度，今天与 Yiwen 对齐。</w:t>
             </w:r>
           </w:p>
           <w:p>
@@ -882,7 +882,7 @@
                 <w:color w:val="1C2833"/>
                 <w:sz w:val="20"/>
               </w:rPr>
-              <w:t>• Ewan 建议增加预冷。</w:t>
+              <w:t>• Yiwen 建议增加预冷。</w:t>
             </w:r>
           </w:p>
           <w:p>
@@ -1589,7 +1589,7 @@
                 <w:color w:val="1C2833"/>
                 <w:sz w:val="20"/>
               </w:rPr>
-              <w:t>• 下午 QA、QC 和分析同事讨论后，已告知现场 Jerry 和 Sara：QC 不接受实验室研发样品的检测。</w:t>
+              <w:t>• 下午 QA、QC 和分析同事讨论后，已告知现场 Geariod 和 Sarah：QC 不接受实验室研发样品的检测。</w:t>
             </w:r>
           </w:p>
           <w:p>
@@ -1682,7 +1682,7 @@
                 <w:color w:val="1C2833"/>
                 <w:sz w:val="20"/>
               </w:rPr>
-              <w:t>Jerry、Sara 回去内部对齐后再定后续做法。TSP 其余事项没有遗留。</w:t>
+              <w:t>Geariod、Sarah 回去内部对齐后再定后续做法。TSP 其余事项没有遗留。</w:t>
             </w:r>
           </w:p>
         </w:tc>
@@ -2375,7 +2375,7 @@
                 <w:color w:val="1C2833"/>
                 <w:sz w:val="20"/>
               </w:rPr>
-              <w:t>• 与 Sara 讨论 PQ readiness。模板本身没有被指出问题。</w:t>
+              <w:t>• 与 Sarah 讨论 PQ readiness。模板本身没有被指出问题。</w:t>
             </w:r>
           </w:p>
         </w:tc>
@@ -2657,7 +2657,7 @@
                 <w:color w:val="1C2833"/>
                 <w:sz w:val="20"/>
               </w:rPr>
-              <w:t>• Ewan 提出材质问题。信息今天已转给 Jerry 和 Sara。</w:t>
+              <w:t>• Yiwen 提出材质问题。信息今天已转给 Geariod 和 Sarah。</w:t>
             </w:r>
           </w:p>
           <w:p>
@@ -3034,7 +3034,7 @@
                 <w:color w:val="1C2833"/>
                 <w:sz w:val="20"/>
               </w:rPr>
-              <w:t>• 此前向 Ewan 反馈的是 level 1 data check。</w:t>
+              <w:t>• 此前向 Yiwen 反馈的是 level 1 data check。</w:t>
             </w:r>
           </w:p>
           <w:p>
@@ -3393,7 +3393,7 @@
                 <w:color w:val="1C2833"/>
                 <w:sz w:val="20"/>
               </w:rPr>
-              <w:t>Jerry 对当前说明没有进一步意见。</w:t>
+              <w:t>Geariod 对当前说明没有进一步意见。</w:t>
             </w:r>
           </w:p>
         </w:tc>
@@ -3417,7 +3417,7 @@
           <w:color w:val="1B4F72"/>
           <w:sz w:val="24"/>
         </w:rPr>
-        <w:t>12. 明日现场：DIPA 投料</w:t>
+        <w:t>12. 明日现场：DIPEA 投料</w:t>
       </w:r>
     </w:p>
     <w:tbl>
@@ -3551,7 +3551,7 @@
                 <w:color w:val="1C2833"/>
                 <w:sz w:val="20"/>
               </w:rPr>
-              <w:t>• 明天指定看 DIPA 投料细节。物料流程已经确认，接下来要看现场怎么把料投进去。</w:t>
+              <w:t>• 明天指定看 DIPEA 投料细节。物料流程已经确认，接下来要看现场怎么把料投进去。</w:t>
             </w:r>
           </w:p>
           <w:p>
@@ -3567,7 +3567,7 @@
                 <w:color w:val="1C2833"/>
                 <w:sz w:val="20"/>
               </w:rPr>
-              <w:t>• 关心投料过程如何密封加入。只有两个点加入 DIPA。</w:t>
+              <w:t>• 关心投料过程如何密封加入。只有两个点加入 DIPEA。</w:t>
             </w:r>
           </w:p>
         </w:tc>
@@ -3630,7 +3630,7 @@
                 <w:color w:val="1C2833"/>
                 <w:sz w:val="20"/>
               </w:rPr>
-              <w:t>• 用实物 DIPA，还是用溶液做模拟，下来再定，也可以直接问客户。客户若要看实物，再领料实投。</w:t>
+              <w:t>• 用实物 DIPEA，还是用溶液做模拟，下来再定，也可以直接问客户。客户若要看实物，再领料实投。</w:t>
             </w:r>
           </w:p>
           <w:p>
@@ -3678,7 +3678,7 @@
                 <w:color w:val="1C2833"/>
                 <w:sz w:val="20"/>
               </w:rPr>
-              <w:t>• 需要讲清的控制：DIPA 见光会生成乙醛，是 9788 杂质的一个来源，与光照和暴露时间有关。开盖、关盖时做氮气保护，尽量避光。</w:t>
+              <w:t>• 需要讲清的控制：DIPEA 见光会生成乙醛，是 9788 杂质的一个来源，与光照和暴露时间有关。开盖、关盖时做氮气保护，尽量避光。</w:t>
             </w:r>
           </w:p>
         </w:tc>
@@ -3739,7 +3739,7 @@
                 <w:color w:val="1C2833"/>
                 <w:sz w:val="20"/>
               </w:rPr>
-              <w:t>明天到现场讲 DIPA 投料。实物还是模拟，投料前与客户确认。</w:t>
+              <w:t>明天到现场讲 DIPEA 投料。实物还是模拟，投料前与客户确认。</w:t>
             </w:r>
           </w:p>
         </w:tc>
@@ -4061,7 +4061,7 @@
           <w:color w:val="1B4F72"/>
           <w:sz w:val="24"/>
         </w:rPr>
-        <w:t>14. DIPA 从普通区到受控区的转移</w:t>
+        <w:t>14. DIPEA 从普通区到受控区的转移</w:t>
       </w:r>
     </w:p>
     <w:tbl>
@@ -4195,7 +4195,7 @@
                 <w:color w:val="1C2833"/>
                 <w:sz w:val="20"/>
               </w:rPr>
-              <w:t>• 本次访问中看过 DIPA 的转移路线。从普通区到受控区这一段缺少控制。</w:t>
+              <w:t>• 本次访问中看过 DIPEA 的转移路线。从普通区到受控区这一段缺少控制。</w:t>
             </w:r>
           </w:p>
           <w:p>
@@ -4838,7 +4838,7 @@
                 <w:color w:val="1C2833"/>
                 <w:sz w:val="20"/>
               </w:rPr>
-              <w:t>• 明天由韩一杰下来解释。</w:t>
+              <w:t>• 明天由 QC 人员下来解释。</w:t>
             </w:r>
           </w:p>
         </w:tc>
@@ -5120,7 +5120,7 @@
                 <w:color w:val="1C2833"/>
                 <w:sz w:val="19"/>
               </w:rPr>
-              <w:t>今晚核对 Ewan、Sonia 是否还有新 comment。没有的话，请三萌关闭两个 GAP 文件并更新状态；有的话，明天在现场继续讨论。</w:t>
+              <w:t>今晚核对 Yiwen、Sonia 是否还有新 comment。没有的话，请三萌关闭两个 GAP 文件并更新状态；有的话，明天在现场继续讨论。</w:t>
             </w:r>
           </w:p>
         </w:tc>
@@ -5477,7 +5477,7 @@
                 <w:color w:val="1C2833"/>
                 <w:sz w:val="19"/>
               </w:rPr>
-              <w:t>等 Jerry、Sara 对齐切割小试的检测地点。若仍要求 QC 检测，用纸质记录完善流程，并确认适用于 PPQ 三批，还是后续商业化批次同样执行。</w:t>
+              <w:t>等 Geariod、Sarah 对齐切割小试的检测地点。若仍要求 QC 检测，用纸质记录完善流程，并确认适用于 PPQ 三批，还是后续商业化批次同样执行。</w:t>
             </w:r>
           </w:p>
         </w:tc>
@@ -5953,7 +5953,7 @@
                 <w:color w:val="1C2833"/>
                 <w:sz w:val="19"/>
               </w:rPr>
-              <w:t>明天现场讲解 DIPA 投料。先与客户确认用实物还是模拟；说明密封加入、流速和温度控制，以及避光、开盖时氮气保护。</w:t>
+              <w:t>明天现场讲解 DIPEA 投料。先与客户确认用实物还是模拟；说明密封加入、流速和温度控制，以及避光、开盖时氮气保护。</w:t>
             </w:r>
           </w:p>
         </w:tc>
@@ -5982,7 +5982,7 @@
                 <w:color w:val="1C2833"/>
                 <w:sz w:val="19"/>
               </w:rPr>
-              <w:t>DIPA 投料</w:t>
+              <w:t>DIPEA 投料</w:t>
             </w:r>
           </w:p>
         </w:tc>
@@ -6310,7 +6310,7 @@
                 <w:color w:val="1C2833"/>
                 <w:sz w:val="19"/>
               </w:rPr>
-              <w:t>向礼来反馈 DIPA 从普通区转移到受控区的短期措施和当前实施情况。</w:t>
+              <w:t>向礼来反馈 DIPEA 从普通区转移到受控区的短期措施和当前实施情况。</w:t>
             </w:r>
           </w:p>
         </w:tc>
@@ -6338,7 +6338,7 @@
                 <w:color w:val="1C2833"/>
                 <w:sz w:val="19"/>
               </w:rPr>
-              <w:t>DIPA 转移</w:t>
+              <w:t>DIPEA 转移</w:t>
             </w:r>
           </w:p>
         </w:tc>
@@ -6429,7 +6429,7 @@
                 <w:color w:val="1C2833"/>
                 <w:sz w:val="19"/>
               </w:rPr>
-              <w:t>由韩一杰解释 QC 昨天的遗留问题。</w:t>
+              <w:t>由 QC 人员解释 QC 昨天的遗留问题。</w:t>
             </w:r>
           </w:p>
         </w:tc>

</xml_diff>